<commit_message>
feat: refresh document workflows and delivery demo
</commit_message>
<xml_diff>
--- a/assets/templates/Templates/CпортЭКГ_шаблон.docx
+++ b/assets/templates/Templates/CпортЭКГ_шаблон.docx
@@ -1,6 +1,6 @@
 
 <file path=word/document.xml><?xml version="1.0" encoding="utf-8"?>
-<w:document xmlns:wpc="http://schemas.microsoft.com/office/word/2010/wordprocessingCanvas" xmlns:mc="http://schemas.openxmlformats.org/markup-compatibility/2006" xmlns:o="urn:schemas-microsoft-com:office:office" xmlns:r="http://schemas.openxmlformats.org/officeDocument/2006/relationships" xmlns:m="http://schemas.openxmlformats.org/officeDocument/2006/math" xmlns:v="urn:schemas-microsoft-com:vml" xmlns:wp14="http://schemas.microsoft.com/office/word/2010/wordprocessingDrawing" xmlns:wp="http://schemas.openxmlformats.org/drawingml/2006/wordprocessingDrawing" xmlns:w10="urn:schemas-microsoft-com:office:word" xmlns:w="http://schemas.openxmlformats.org/wordprocessingml/2006/main" xmlns:w14="http://schemas.microsoft.com/office/word/2010/wordml" xmlns:wpg="http://schemas.microsoft.com/office/word/2010/wordprocessingGroup" xmlns:wpi="http://schemas.microsoft.com/office/word/2010/wordprocessingInk" xmlns:wne="http://schemas.microsoft.com/office/word/2006/wordml" xmlns:wps="http://schemas.microsoft.com/office/word/2010/wordprocessingShape" mc:Ignorable="w14 wp14">
+<w:document xmlns:mc="http://schemas.openxmlformats.org/markup-compatibility/2006" xmlns:r="http://schemas.openxmlformats.org/officeDocument/2006/relationships" xmlns:w="http://schemas.openxmlformats.org/wordprocessingml/2006/main" xmlns:w14="http://schemas.microsoft.com/office/word/2010/wordml" mc:Ignorable="w14 wp14">
   <w:body>
     <w:p>
       <w:pPr>
@@ -626,15 +626,15 @@
           <w:sz w:val="28"/>
           <w:szCs w:val="32"/>
         </w:rPr>
-        <w:t>Заключение терапевта</w:t>
-      </w:r>
-      <w:r>
-        <w:rPr>
-          <w:rFonts w:ascii="Times New Roman" w:hAnsi="Times New Roman" w:cs="Times New Roman"/>
-          <w:sz w:val="28"/>
-          <w:szCs w:val="32"/>
-        </w:rPr>
-        <w:t xml:space="preserve">: соматическая патология </w:t>
+        <w:t>Заключение терапевта: [SportDiagnosis]</w:t>
+      </w:r>
+      <w:r>
+        <w:rPr>
+          <w:rFonts w:ascii="Times New Roman" w:hAnsi="Times New Roman" w:cs="Times New Roman"/>
+          <w:sz w:val="28"/>
+          <w:szCs w:val="32"/>
+        </w:rPr>
+        <w:t xml:space="preserve"/>
       </w:r>
       <w:r>
         <w:rPr>
@@ -643,15 +643,15 @@
           <w:sz w:val="28"/>
           <w:szCs w:val="32"/>
         </w:rPr>
-        <w:t>Выявлена</w:t>
-      </w:r>
-      <w:r>
-        <w:rPr>
-          <w:rFonts w:ascii="Times New Roman" w:hAnsi="Times New Roman" w:cs="Times New Roman"/>
-          <w:sz w:val="28"/>
-          <w:szCs w:val="32"/>
-        </w:rPr>
-        <w:t xml:space="preserve">, </w:t>
+        <w:t/>
+      </w:r>
+      <w:r>
+        <w:rPr>
+          <w:rFonts w:ascii="Times New Roman" w:hAnsi="Times New Roman" w:cs="Times New Roman"/>
+          <w:sz w:val="28"/>
+          <w:szCs w:val="32"/>
+        </w:rPr>
+        <w:t xml:space="preserve"/>
       </w:r>
       <w:r>
         <w:rPr>
@@ -661,15 +661,15 @@
           <w:szCs w:val="32"/>
           <w:u w:val="single"/>
         </w:rPr>
-        <w:t>НЕ Выявлена</w:t>
-      </w:r>
-      <w:r>
-        <w:rPr>
-          <w:rFonts w:ascii="Times New Roman" w:hAnsi="Times New Roman" w:cs="Times New Roman"/>
-          <w:sz w:val="28"/>
-          <w:szCs w:val="32"/>
-        </w:rPr>
-        <w:t xml:space="preserve"> </w:t>
+        <w:t/>
+      </w:r>
+      <w:r>
+        <w:rPr>
+          <w:rFonts w:ascii="Times New Roman" w:hAnsi="Times New Roman" w:cs="Times New Roman"/>
+          <w:sz w:val="28"/>
+          <w:szCs w:val="32"/>
+        </w:rPr>
+        <w:t xml:space="preserve"/>
       </w:r>
     </w:p>
     <w:p>
@@ -688,7 +688,7 @@
           <w:sz w:val="20"/>
           <w:szCs w:val="32"/>
         </w:rPr>
-        <w:t xml:space="preserve">  </w:t>
+        <w:t xml:space="preserve">Медицинские требования: [SportMedicalRequirements]</w:t>
       </w:r>
       <w:r>
         <w:rPr>
@@ -696,7 +696,7 @@
           <w:sz w:val="20"/>
           <w:szCs w:val="32"/>
         </w:rPr>
-        <w:t xml:space="preserve">нужное </w:t>
+        <w:t xml:space="preserve"/>
       </w:r>
       <w:r>
         <w:rPr>
@@ -704,7 +704,7 @@
           <w:sz w:val="20"/>
           <w:szCs w:val="32"/>
         </w:rPr>
-        <w:t>подчеркнуть</w:t>
+        <w:t/>
       </w:r>
     </w:p>
     <w:p>
@@ -722,7 +722,7 @@
           <w:sz w:val="28"/>
           <w:szCs w:val="32"/>
         </w:rPr>
-        <w:t xml:space="preserve">Противопоказания к занятиям спортом    </w:t>
+        <w:t xml:space="preserve">Противопоказания к занятиям спортом: [SportContraindications]</w:t>
       </w:r>
     </w:p>
     <w:p>
@@ -744,15 +744,15 @@
           <w:sz w:val="28"/>
           <w:szCs w:val="32"/>
         </w:rPr>
-        <w:t>Выявлена</w:t>
-      </w:r>
-      <w:r>
-        <w:rPr>
-          <w:rFonts w:ascii="Times New Roman" w:hAnsi="Times New Roman" w:cs="Times New Roman"/>
-          <w:sz w:val="28"/>
-          <w:szCs w:val="32"/>
-        </w:rPr>
-        <w:t xml:space="preserve">, </w:t>
+        <w:t>Флюорография: [SportFluorography]</w:t>
+      </w:r>
+      <w:r>
+        <w:rPr>
+          <w:rFonts w:ascii="Times New Roman" w:hAnsi="Times New Roman" w:cs="Times New Roman"/>
+          <w:sz w:val="28"/>
+          <w:szCs w:val="32"/>
+        </w:rPr>
+        <w:t xml:space="preserve"/>
       </w:r>
       <w:r>
         <w:rPr>
@@ -762,7 +762,7 @@
           <w:szCs w:val="32"/>
           <w:u w:val="single"/>
         </w:rPr>
-        <w:t>НЕ Выявлена</w:t>
+        <w:t/>
       </w:r>
     </w:p>
     <w:p>
@@ -781,7 +781,7 @@
           <w:sz w:val="20"/>
           <w:szCs w:val="32"/>
         </w:rPr>
-        <w:t xml:space="preserve">  </w:t>
+        <w:t xml:space="preserve"/>
       </w:r>
       <w:r>
         <w:rPr>
@@ -789,7 +789,7 @@
           <w:sz w:val="20"/>
           <w:szCs w:val="32"/>
         </w:rPr>
-        <w:t xml:space="preserve">нужное </w:t>
+        <w:t xml:space="preserve"/>
       </w:r>
       <w:r>
         <w:rPr>
@@ -797,7 +797,7 @@
           <w:sz w:val="20"/>
           <w:szCs w:val="32"/>
         </w:rPr>
-        <w:t>подчеркнуть</w:t>
+        <w:t/>
       </w:r>
     </w:p>
     <w:p>
@@ -816,15 +816,15 @@
           <w:sz w:val="28"/>
           <w:szCs w:val="32"/>
         </w:rPr>
-        <w:t xml:space="preserve">ЭКГ </w:t>
-      </w:r>
-      <w:r>
-        <w:rPr>
-          <w:rFonts w:ascii="Times New Roman" w:hAnsi="Times New Roman" w:cs="Times New Roman"/>
-          <w:sz w:val="24"/>
-          <w:szCs w:val="32"/>
-        </w:rPr>
-        <w:t xml:space="preserve"> </w:t>
+        <w:t xml:space="preserve">ЭКГ: [SportEkg]</w:t>
+      </w:r>
+      <w:r>
+        <w:rPr>
+          <w:rFonts w:ascii="Times New Roman" w:hAnsi="Times New Roman" w:cs="Times New Roman"/>
+          <w:sz w:val="24"/>
+          <w:szCs w:val="32"/>
+        </w:rPr>
+        <w:t xml:space="preserve"/>
       </w:r>
       <w:r>
         <w:rPr>
@@ -833,7 +833,7 @@
           <w:szCs w:val="32"/>
           <w:u w:val="single"/>
         </w:rPr>
-        <w:t>Медицинский  центр ООО «Мед-Авто»</w:t>
+        <w:t/>
       </w:r>
       <w:r>
         <w:rPr>
@@ -842,7 +842,7 @@
           <w:szCs w:val="32"/>
           <w:u w:val="single"/>
         </w:rPr>
-        <w:t xml:space="preserve">, ЭКГ от </w:t>
+        <w:t xml:space="preserve"/>
       </w:r>
       <w:r>
         <w:rPr>
@@ -851,7 +851,7 @@
           <w:szCs w:val="32"/>
           <w:u w:val="single"/>
         </w:rPr>
-        <w:t>[</w:t>
+        <w:t/>
       </w:r>
       <w:proofErr w:type="spellStart"/>
       <w:r>
@@ -862,7 +862,7 @@
           <w:u w:val="single"/>
           <w:lang w:val="en-US"/>
         </w:rPr>
-        <w:t>VisitDate</w:t>
+        <w:t/>
       </w:r>
       <w:proofErr w:type="spellEnd"/>
       <w:r>
@@ -872,7 +872,7 @@
           <w:szCs w:val="32"/>
           <w:u w:val="single"/>
         </w:rPr>
-        <w:t>]</w:t>
+        <w:t/>
       </w:r>
       <w:r>
         <w:rPr>
@@ -881,7 +881,7 @@
           <w:szCs w:val="32"/>
           <w:u w:val="single"/>
         </w:rPr>
-        <w:t>г.</w:t>
+        <w:t/>
       </w:r>
       <w:bookmarkStart w:id="0" w:name="_GoBack"/>
       <w:bookmarkEnd w:id="0"/>
@@ -901,7 +901,7 @@
           <w:sz w:val="24"/>
           <w:szCs w:val="32"/>
         </w:rPr>
-        <w:t xml:space="preserve">Заниматься </w:t>
+        <w:t xml:space="preserve">Заключение ЭКГ: [SportEkgConclusion]</w:t>
       </w:r>
       <w:proofErr w:type="gramStart"/>
       <w:r>
@@ -911,7 +911,7 @@
           <w:sz w:val="24"/>
           <w:szCs w:val="32"/>
         </w:rPr>
-        <w:t>Допущен</w:t>
+        <w:t/>
       </w:r>
       <w:proofErr w:type="gramEnd"/>
       <w:r>
@@ -921,7 +921,7 @@
           <w:sz w:val="24"/>
           <w:szCs w:val="32"/>
         </w:rPr>
-        <w:t xml:space="preserve"> к у</w:t>
+        <w:t xml:space="preserve"/>
       </w:r>
       <w:r>
         <w:rPr>
@@ -930,7 +930,7 @@
           <w:sz w:val="24"/>
           <w:szCs w:val="32"/>
         </w:rPr>
-        <w:t xml:space="preserve">частию в соревнованиях по самбо </w:t>
+        <w:t xml:space="preserve"/>
       </w:r>
       <w:r>
         <w:rPr>
@@ -939,7 +939,7 @@
           <w:sz w:val="24"/>
           <w:szCs w:val="32"/>
         </w:rPr>
-        <w:t>»</w:t>
+        <w:t/>
       </w:r>
       <w:r>
         <w:rPr>
@@ -948,7 +948,7 @@
           <w:sz w:val="24"/>
           <w:szCs w:val="32"/>
         </w:rPr>
-        <w:t>.</w:t>
+        <w:t/>
       </w:r>
     </w:p>
     <w:p>
@@ -969,7 +969,7 @@
           <w:sz w:val="24"/>
           <w:szCs w:val="32"/>
         </w:rPr>
-        <w:t xml:space="preserve"> не противопоказано </w:t>
+        <w:t xml:space="preserve">[SportConclusionText]</w:t>
       </w:r>
     </w:p>
     <w:p>
@@ -1083,23 +1083,23 @@
           <w:sz w:val="24"/>
           <w:szCs w:val="32"/>
         </w:rPr>
-        <w:t xml:space="preserve"> М.П.                                                                                   </w:t>
-      </w:r>
-      <w:r>
-        <w:rPr>
-          <w:rFonts w:ascii="Times New Roman" w:hAnsi="Times New Roman" w:cs="Times New Roman"/>
-          <w:sz w:val="24"/>
-          <w:szCs w:val="32"/>
-        </w:rPr>
-        <w:t xml:space="preserve">Врач </w:t>
-      </w:r>
-      <w:r>
-        <w:rPr>
-          <w:rFonts w:ascii="Times New Roman" w:hAnsi="Times New Roman" w:cs="Times New Roman"/>
-          <w:sz w:val="24"/>
-          <w:szCs w:val="32"/>
-        </w:rPr>
-        <w:t xml:space="preserve"> </w:t>
+        <w:t xml:space="preserve">М.П.                                                                                   Врач [ChairmanDoctor]</w:t>
+      </w:r>
+      <w:r>
+        <w:rPr>
+          <w:rFonts w:ascii="Times New Roman" w:hAnsi="Times New Roman" w:cs="Times New Roman"/>
+          <w:sz w:val="24"/>
+          <w:szCs w:val="32"/>
+        </w:rPr>
+        <w:t xml:space="preserve"/>
+      </w:r>
+      <w:r>
+        <w:rPr>
+          <w:rFonts w:ascii="Times New Roman" w:hAnsi="Times New Roman" w:cs="Times New Roman"/>
+          <w:sz w:val="24"/>
+          <w:szCs w:val="32"/>
+        </w:rPr>
+        <w:t xml:space="preserve"/>
       </w:r>
       <w:r>
         <w:rPr>
@@ -1108,7 +1108,7 @@
           <w:szCs w:val="32"/>
           <w:u w:val="single"/>
         </w:rPr>
-        <w:t xml:space="preserve">                            Сибирцев В.А                                </w:t>
+        <w:t xml:space="preserve"/>
       </w:r>
     </w:p>
     <w:p>

</xml_diff>